<commit_message>
Add Slot2 Spring Boot demo project and update Slot1 document
</commit_message>
<xml_diff>
--- a/Slot1/LeQuangMinh_De190071.docx
+++ b/Slot1/LeQuangMinh_De190071.docx
@@ -9952,6 +9952,8 @@
       <w:pPr>
         <w:rPr>
           <w:rFonts w:ascii="Times New Roman" w:eastAsiaTheme="majorEastAsia" w:hAnsi="Times New Roman" w:cs="Times New Roman"/>
+          <w:b/>
+          <w:bCs/>
           <w:kern w:val="2"/>
           <w:sz w:val="28"/>
           <w:szCs w:val="28"/>
@@ -9963,6 +9965,8 @@
       <w:r>
         <w:rPr>
           <w:rFonts w:ascii="Times New Roman" w:eastAsiaTheme="majorEastAsia" w:hAnsi="Times New Roman" w:cs="Times New Roman"/>
+          <w:b/>
+          <w:bCs/>
           <w:kern w:val="2"/>
           <w:sz w:val="28"/>
           <w:szCs w:val="28"/>
@@ -9975,18 +9979,22 @@
       <w:r>
         <w:rPr>
           <w:rFonts w:ascii="Times New Roman" w:eastAsiaTheme="majorEastAsia" w:hAnsi="Times New Roman" w:cs="Times New Roman"/>
-          <w:kern w:val="2"/>
-          <w:sz w:val="28"/>
-          <w:szCs w:val="28"/>
-          <w:lang w:eastAsia="ja-JP"/>
-          <w14:ligatures w14:val="standardContextual"/>
-        </w:rPr>
-        <w:t xml:space="preserve"> </w:t>
-      </w:r>
-      <w:proofErr w:type="spellStart"/>
-      <w:r>
-        <w:rPr>
-          <w:rFonts w:ascii="Times New Roman" w:eastAsiaTheme="majorEastAsia" w:hAnsi="Times New Roman" w:cs="Times New Roman"/>
+          <w:b/>
+          <w:bCs/>
+          <w:kern w:val="2"/>
+          <w:sz w:val="28"/>
+          <w:szCs w:val="28"/>
+          <w:lang w:eastAsia="ja-JP"/>
+          <w14:ligatures w14:val="standardContextual"/>
+        </w:rPr>
+        <w:t xml:space="preserve"> </w:t>
+      </w:r>
+      <w:proofErr w:type="spellStart"/>
+      <w:r>
+        <w:rPr>
+          <w:rFonts w:ascii="Times New Roman" w:eastAsiaTheme="majorEastAsia" w:hAnsi="Times New Roman" w:cs="Times New Roman"/>
+          <w:b/>
+          <w:bCs/>
           <w:kern w:val="2"/>
           <w:sz w:val="28"/>
           <w:szCs w:val="28"/>
@@ -9999,18 +10007,22 @@
       <w:r>
         <w:rPr>
           <w:rFonts w:ascii="Times New Roman" w:eastAsiaTheme="majorEastAsia" w:hAnsi="Times New Roman" w:cs="Times New Roman"/>
-          <w:kern w:val="2"/>
-          <w:sz w:val="28"/>
-          <w:szCs w:val="28"/>
-          <w:lang w:eastAsia="ja-JP"/>
-          <w14:ligatures w14:val="standardContextual"/>
-        </w:rPr>
-        <w:t xml:space="preserve"> </w:t>
-      </w:r>
-      <w:proofErr w:type="spellStart"/>
-      <w:r>
-        <w:rPr>
-          <w:rFonts w:ascii="Times New Roman" w:eastAsiaTheme="majorEastAsia" w:hAnsi="Times New Roman" w:cs="Times New Roman"/>
+          <w:b/>
+          <w:bCs/>
+          <w:kern w:val="2"/>
+          <w:sz w:val="28"/>
+          <w:szCs w:val="28"/>
+          <w:lang w:eastAsia="ja-JP"/>
+          <w14:ligatures w14:val="standardContextual"/>
+        </w:rPr>
+        <w:t xml:space="preserve"> </w:t>
+      </w:r>
+      <w:proofErr w:type="spellStart"/>
+      <w:r>
+        <w:rPr>
+          <w:rFonts w:ascii="Times New Roman" w:eastAsiaTheme="majorEastAsia" w:hAnsi="Times New Roman" w:cs="Times New Roman"/>
+          <w:b/>
+          <w:bCs/>
           <w:kern w:val="2"/>
           <w:sz w:val="28"/>
           <w:szCs w:val="28"/>
@@ -10023,6 +10035,8 @@
       <w:r>
         <w:rPr>
           <w:rFonts w:ascii="Times New Roman" w:eastAsiaTheme="majorEastAsia" w:hAnsi="Times New Roman" w:cs="Times New Roman"/>
+          <w:b/>
+          <w:bCs/>
           <w:kern w:val="2"/>
           <w:sz w:val="28"/>
           <w:szCs w:val="28"/>
@@ -10035,6 +10049,8 @@
       <w:r>
         <w:rPr>
           <w:rFonts w:ascii="Times New Roman" w:eastAsiaTheme="majorEastAsia" w:hAnsi="Times New Roman" w:cs="Times New Roman"/>
+          <w:b/>
+          <w:bCs/>
           <w:kern w:val="2"/>
           <w:sz w:val="28"/>
           <w:szCs w:val="28"/>
@@ -10047,18 +10063,22 @@
       <w:r>
         <w:rPr>
           <w:rFonts w:ascii="Times New Roman" w:eastAsiaTheme="majorEastAsia" w:hAnsi="Times New Roman" w:cs="Times New Roman"/>
-          <w:kern w:val="2"/>
-          <w:sz w:val="28"/>
-          <w:szCs w:val="28"/>
-          <w:lang w:eastAsia="ja-JP"/>
-          <w14:ligatures w14:val="standardContextual"/>
-        </w:rPr>
-        <w:t xml:space="preserve"> </w:t>
-      </w:r>
-      <w:proofErr w:type="spellStart"/>
-      <w:r>
-        <w:rPr>
-          <w:rFonts w:ascii="Times New Roman" w:eastAsiaTheme="majorEastAsia" w:hAnsi="Times New Roman" w:cs="Times New Roman"/>
+          <w:b/>
+          <w:bCs/>
+          <w:kern w:val="2"/>
+          <w:sz w:val="28"/>
+          <w:szCs w:val="28"/>
+          <w:lang w:eastAsia="ja-JP"/>
+          <w14:ligatures w14:val="standardContextual"/>
+        </w:rPr>
+        <w:t xml:space="preserve"> </w:t>
+      </w:r>
+      <w:proofErr w:type="spellStart"/>
+      <w:r>
+        <w:rPr>
+          <w:rFonts w:ascii="Times New Roman" w:eastAsiaTheme="majorEastAsia" w:hAnsi="Times New Roman" w:cs="Times New Roman"/>
+          <w:b/>
+          <w:bCs/>
           <w:kern w:val="2"/>
           <w:sz w:val="28"/>
           <w:szCs w:val="28"/>
@@ -10071,6 +10091,8 @@
       <w:r>
         <w:rPr>
           <w:rFonts w:ascii="Times New Roman" w:eastAsiaTheme="majorEastAsia" w:hAnsi="Times New Roman" w:cs="Times New Roman"/>
+          <w:b/>
+          <w:bCs/>
           <w:kern w:val="2"/>
           <w:sz w:val="28"/>
           <w:szCs w:val="28"/>
@@ -10084,6 +10106,8 @@
       <w:pPr>
         <w:rPr>
           <w:rFonts w:ascii="Times New Roman" w:eastAsiaTheme="majorEastAsia" w:hAnsi="Times New Roman" w:cs="Times New Roman"/>
+          <w:b/>
+          <w:bCs/>
           <w:kern w:val="2"/>
           <w:sz w:val="28"/>
           <w:szCs w:val="28"/>
@@ -10095,6 +10119,8 @@
       <w:r>
         <w:rPr>
           <w:rFonts w:ascii="Times New Roman" w:eastAsiaTheme="majorEastAsia" w:hAnsi="Times New Roman" w:cs="Times New Roman"/>
+          <w:b/>
+          <w:bCs/>
           <w:kern w:val="2"/>
           <w:sz w:val="28"/>
           <w:szCs w:val="28"/>
@@ -10107,18 +10133,22 @@
       <w:r>
         <w:rPr>
           <w:rFonts w:ascii="Times New Roman" w:eastAsiaTheme="majorEastAsia" w:hAnsi="Times New Roman" w:cs="Times New Roman"/>
-          <w:kern w:val="2"/>
-          <w:sz w:val="28"/>
-          <w:szCs w:val="28"/>
-          <w:lang w:eastAsia="ja-JP"/>
-          <w14:ligatures w14:val="standardContextual"/>
-        </w:rPr>
-        <w:t xml:space="preserve"> </w:t>
-      </w:r>
-      <w:proofErr w:type="spellStart"/>
-      <w:r>
-        <w:rPr>
-          <w:rFonts w:ascii="Times New Roman" w:eastAsiaTheme="majorEastAsia" w:hAnsi="Times New Roman" w:cs="Times New Roman"/>
+          <w:b/>
+          <w:bCs/>
+          <w:kern w:val="2"/>
+          <w:sz w:val="28"/>
+          <w:szCs w:val="28"/>
+          <w:lang w:eastAsia="ja-JP"/>
+          <w14:ligatures w14:val="standardContextual"/>
+        </w:rPr>
+        <w:t xml:space="preserve"> </w:t>
+      </w:r>
+      <w:proofErr w:type="spellStart"/>
+      <w:r>
+        <w:rPr>
+          <w:rFonts w:ascii="Times New Roman" w:eastAsiaTheme="majorEastAsia" w:hAnsi="Times New Roman" w:cs="Times New Roman"/>
+          <w:b/>
+          <w:bCs/>
           <w:kern w:val="2"/>
           <w:sz w:val="28"/>
           <w:szCs w:val="28"/>
@@ -10131,6 +10161,8 @@
       <w:r>
         <w:rPr>
           <w:rFonts w:ascii="Times New Roman" w:eastAsiaTheme="majorEastAsia" w:hAnsi="Times New Roman" w:cs="Times New Roman"/>
+          <w:b/>
+          <w:bCs/>
           <w:kern w:val="2"/>
           <w:sz w:val="28"/>
           <w:szCs w:val="28"/>
@@ -10180,6 +10212,8 @@
       <w:pPr>
         <w:rPr>
           <w:rFonts w:ascii="Times New Roman" w:eastAsiaTheme="majorEastAsia" w:hAnsi="Times New Roman" w:cs="Times New Roman"/>
+          <w:b/>
+          <w:bCs/>
           <w:kern w:val="2"/>
           <w:sz w:val="28"/>
           <w:szCs w:val="28"/>
@@ -10191,6 +10225,8 @@
       <w:r>
         <w:rPr>
           <w:rFonts w:ascii="Times New Roman" w:eastAsiaTheme="majorEastAsia" w:hAnsi="Times New Roman" w:cs="Times New Roman"/>
+          <w:b/>
+          <w:bCs/>
           <w:kern w:val="2"/>
           <w:sz w:val="28"/>
           <w:szCs w:val="28"/>
@@ -10203,18 +10239,22 @@
       <w:r>
         <w:rPr>
           <w:rFonts w:ascii="Times New Roman" w:eastAsiaTheme="majorEastAsia" w:hAnsi="Times New Roman" w:cs="Times New Roman"/>
-          <w:kern w:val="2"/>
-          <w:sz w:val="28"/>
-          <w:szCs w:val="28"/>
-          <w:lang w:eastAsia="ja-JP"/>
-          <w14:ligatures w14:val="standardContextual"/>
-        </w:rPr>
-        <w:t xml:space="preserve"> </w:t>
-      </w:r>
-      <w:proofErr w:type="spellStart"/>
-      <w:r>
-        <w:rPr>
-          <w:rFonts w:ascii="Times New Roman" w:eastAsiaTheme="majorEastAsia" w:hAnsi="Times New Roman" w:cs="Times New Roman"/>
+          <w:b/>
+          <w:bCs/>
+          <w:kern w:val="2"/>
+          <w:sz w:val="28"/>
+          <w:szCs w:val="28"/>
+          <w:lang w:eastAsia="ja-JP"/>
+          <w14:ligatures w14:val="standardContextual"/>
+        </w:rPr>
+        <w:t xml:space="preserve"> </w:t>
+      </w:r>
+      <w:proofErr w:type="spellStart"/>
+      <w:r>
+        <w:rPr>
+          <w:rFonts w:ascii="Times New Roman" w:eastAsiaTheme="majorEastAsia" w:hAnsi="Times New Roman" w:cs="Times New Roman"/>
+          <w:b/>
+          <w:bCs/>
           <w:kern w:val="2"/>
           <w:sz w:val="28"/>
           <w:szCs w:val="28"/>
@@ -10227,18 +10267,22 @@
       <w:r>
         <w:rPr>
           <w:rFonts w:ascii="Times New Roman" w:eastAsiaTheme="majorEastAsia" w:hAnsi="Times New Roman" w:cs="Times New Roman"/>
-          <w:kern w:val="2"/>
-          <w:sz w:val="28"/>
-          <w:szCs w:val="28"/>
-          <w:lang w:eastAsia="ja-JP"/>
-          <w14:ligatures w14:val="standardContextual"/>
-        </w:rPr>
-        <w:t xml:space="preserve"> </w:t>
-      </w:r>
-      <w:proofErr w:type="spellStart"/>
-      <w:r>
-        <w:rPr>
-          <w:rFonts w:ascii="Times New Roman" w:eastAsiaTheme="majorEastAsia" w:hAnsi="Times New Roman" w:cs="Times New Roman"/>
+          <w:b/>
+          <w:bCs/>
+          <w:kern w:val="2"/>
+          <w:sz w:val="28"/>
+          <w:szCs w:val="28"/>
+          <w:lang w:eastAsia="ja-JP"/>
+          <w14:ligatures w14:val="standardContextual"/>
+        </w:rPr>
+        <w:t xml:space="preserve"> </w:t>
+      </w:r>
+      <w:proofErr w:type="spellStart"/>
+      <w:r>
+        <w:rPr>
+          <w:rFonts w:ascii="Times New Roman" w:eastAsiaTheme="majorEastAsia" w:hAnsi="Times New Roman" w:cs="Times New Roman"/>
+          <w:b/>
+          <w:bCs/>
           <w:kern w:val="2"/>
           <w:sz w:val="28"/>
           <w:szCs w:val="28"/>
@@ -10251,18 +10295,22 @@
       <w:r>
         <w:rPr>
           <w:rFonts w:ascii="Times New Roman" w:eastAsiaTheme="majorEastAsia" w:hAnsi="Times New Roman" w:cs="Times New Roman"/>
-          <w:kern w:val="2"/>
-          <w:sz w:val="28"/>
-          <w:szCs w:val="28"/>
-          <w:lang w:eastAsia="ja-JP"/>
-          <w14:ligatures w14:val="standardContextual"/>
-        </w:rPr>
-        <w:t xml:space="preserve"> </w:t>
-      </w:r>
-      <w:proofErr w:type="spellStart"/>
-      <w:r>
-        <w:rPr>
-          <w:rFonts w:ascii="Times New Roman" w:eastAsiaTheme="majorEastAsia" w:hAnsi="Times New Roman" w:cs="Times New Roman"/>
+          <w:b/>
+          <w:bCs/>
+          <w:kern w:val="2"/>
+          <w:sz w:val="28"/>
+          <w:szCs w:val="28"/>
+          <w:lang w:eastAsia="ja-JP"/>
+          <w14:ligatures w14:val="standardContextual"/>
+        </w:rPr>
+        <w:t xml:space="preserve"> </w:t>
+      </w:r>
+      <w:proofErr w:type="spellStart"/>
+      <w:r>
+        <w:rPr>
+          <w:rFonts w:ascii="Times New Roman" w:eastAsiaTheme="majorEastAsia" w:hAnsi="Times New Roman" w:cs="Times New Roman"/>
+          <w:b/>
+          <w:bCs/>
           <w:kern w:val="2"/>
           <w:sz w:val="28"/>
           <w:szCs w:val="28"/>
@@ -10275,6 +10323,8 @@
       <w:r>
         <w:rPr>
           <w:rFonts w:ascii="Times New Roman" w:eastAsiaTheme="majorEastAsia" w:hAnsi="Times New Roman" w:cs="Times New Roman"/>
+          <w:b/>
+          <w:bCs/>
           <w:kern w:val="2"/>
           <w:sz w:val="28"/>
           <w:szCs w:val="28"/>
@@ -10311,6 +10361,8 @@
       <w:pPr>
         <w:rPr>
           <w:rFonts w:ascii="Times New Roman" w:eastAsiaTheme="majorEastAsia" w:hAnsi="Times New Roman" w:cs="Times New Roman"/>
+          <w:b/>
+          <w:bCs/>
           <w:kern w:val="2"/>
           <w:sz w:val="28"/>
           <w:szCs w:val="28"/>
@@ -10322,6 +10374,8 @@
       <w:r>
         <w:rPr>
           <w:rFonts w:ascii="Times New Roman" w:eastAsiaTheme="majorEastAsia" w:hAnsi="Times New Roman" w:cs="Times New Roman"/>
+          <w:b/>
+          <w:bCs/>
           <w:kern w:val="2"/>
           <w:sz w:val="28"/>
           <w:szCs w:val="28"/>
@@ -10334,6 +10388,8 @@
       <w:r>
         <w:rPr>
           <w:rFonts w:ascii="Times New Roman" w:eastAsiaTheme="majorEastAsia" w:hAnsi="Times New Roman" w:cs="Times New Roman"/>
+          <w:b/>
+          <w:bCs/>
           <w:kern w:val="2"/>
           <w:sz w:val="28"/>
           <w:szCs w:val="28"/>
@@ -10346,6 +10402,8 @@
       <w:r>
         <w:rPr>
           <w:rFonts w:ascii="Times New Roman" w:eastAsiaTheme="majorEastAsia" w:hAnsi="Times New Roman" w:cs="Times New Roman"/>
+          <w:b/>
+          <w:bCs/>
           <w:kern w:val="2"/>
           <w:sz w:val="28"/>
           <w:szCs w:val="28"/>
@@ -10358,6 +10416,8 @@
       <w:r>
         <w:rPr>
           <w:rFonts w:ascii="Times New Roman" w:eastAsiaTheme="majorEastAsia" w:hAnsi="Times New Roman" w:cs="Times New Roman"/>
+          <w:b/>
+          <w:bCs/>
           <w:kern w:val="2"/>
           <w:sz w:val="28"/>
           <w:szCs w:val="28"/>
@@ -10387,13 +10447,28 @@
           <w:lang w:eastAsia="ja-JP"/>
           <w14:ligatures w14:val="standardContextual"/>
         </w:rPr>
-        <w:t>git add .</w:t>
-      </w:r>
+        <w:t xml:space="preserve">git </w:t>
+      </w:r>
+      <w:proofErr w:type="gramStart"/>
+      <w:r>
+        <w:rPr>
+          <w:rFonts w:ascii="Times New Roman" w:eastAsiaTheme="majorEastAsia" w:hAnsi="Times New Roman" w:cs="Times New Roman"/>
+          <w:kern w:val="2"/>
+          <w:sz w:val="28"/>
+          <w:szCs w:val="28"/>
+          <w:lang w:eastAsia="ja-JP"/>
+          <w14:ligatures w14:val="standardContextual"/>
+        </w:rPr>
+        <w:t>add .</w:t>
+      </w:r>
+      <w:proofErr w:type="gramEnd"/>
     </w:p>
     <w:p>
       <w:pPr>
         <w:rPr>
           <w:rFonts w:ascii="Times New Roman" w:eastAsiaTheme="majorEastAsia" w:hAnsi="Times New Roman" w:cs="Times New Roman"/>
+          <w:b/>
+          <w:bCs/>
           <w:kern w:val="2"/>
           <w:sz w:val="28"/>
           <w:szCs w:val="28"/>
@@ -10404,6 +10479,8 @@
       <w:r>
         <w:rPr>
           <w:rFonts w:ascii="Times New Roman" w:eastAsiaTheme="majorEastAsia" w:hAnsi="Times New Roman" w:cs="Times New Roman"/>
+          <w:b/>
+          <w:bCs/>
           <w:kern w:val="2"/>
           <w:sz w:val="28"/>
           <w:szCs w:val="28"/>
@@ -10440,6 +10517,8 @@
       <w:pPr>
         <w:rPr>
           <w:rFonts w:ascii="Times New Roman" w:eastAsiaTheme="majorEastAsia" w:hAnsi="Times New Roman" w:cs="Times New Roman"/>
+          <w:b/>
+          <w:bCs/>
           <w:kern w:val="2"/>
           <w:sz w:val="28"/>
           <w:szCs w:val="28"/>
@@ -10450,6 +10529,8 @@
       <w:r>
         <w:rPr>
           <w:rFonts w:ascii="Times New Roman" w:eastAsiaTheme="majorEastAsia" w:hAnsi="Times New Roman" w:cs="Times New Roman"/>
+          <w:b/>
+          <w:bCs/>
           <w:kern w:val="2"/>
           <w:sz w:val="28"/>
           <w:szCs w:val="28"/>
@@ -10462,6 +10543,8 @@
       <w:r>
         <w:rPr>
           <w:rFonts w:ascii="Times New Roman" w:eastAsiaTheme="majorEastAsia" w:hAnsi="Times New Roman" w:cs="Times New Roman"/>
+          <w:b/>
+          <w:bCs/>
           <w:kern w:val="2"/>
           <w:sz w:val="28"/>
           <w:szCs w:val="28"/>
@@ -10474,18 +10557,22 @@
       <w:r>
         <w:rPr>
           <w:rFonts w:ascii="Times New Roman" w:eastAsiaTheme="majorEastAsia" w:hAnsi="Times New Roman" w:cs="Times New Roman"/>
-          <w:kern w:val="2"/>
-          <w:sz w:val="28"/>
-          <w:szCs w:val="28"/>
-          <w:lang w:eastAsia="ja-JP"/>
-          <w14:ligatures w14:val="standardContextual"/>
-        </w:rPr>
-        <w:t xml:space="preserve"> </w:t>
-      </w:r>
-      <w:proofErr w:type="spellStart"/>
-      <w:r>
-        <w:rPr>
-          <w:rFonts w:ascii="Times New Roman" w:eastAsiaTheme="majorEastAsia" w:hAnsi="Times New Roman" w:cs="Times New Roman"/>
+          <w:b/>
+          <w:bCs/>
+          <w:kern w:val="2"/>
+          <w:sz w:val="28"/>
+          <w:szCs w:val="28"/>
+          <w:lang w:eastAsia="ja-JP"/>
+          <w14:ligatures w14:val="standardContextual"/>
+        </w:rPr>
+        <w:t xml:space="preserve"> </w:t>
+      </w:r>
+      <w:proofErr w:type="spellStart"/>
+      <w:r>
+        <w:rPr>
+          <w:rFonts w:ascii="Times New Roman" w:eastAsiaTheme="majorEastAsia" w:hAnsi="Times New Roman" w:cs="Times New Roman"/>
+          <w:b/>
+          <w:bCs/>
           <w:kern w:val="2"/>
           <w:sz w:val="28"/>
           <w:szCs w:val="28"/>
@@ -10498,6 +10585,8 @@
       <w:r>
         <w:rPr>
           <w:rFonts w:ascii="Times New Roman" w:eastAsiaTheme="majorEastAsia" w:hAnsi="Times New Roman" w:cs="Times New Roman"/>
+          <w:b/>
+          <w:bCs/>
           <w:kern w:val="2"/>
           <w:sz w:val="28"/>
           <w:szCs w:val="28"/>
@@ -10534,6 +10623,8 @@
       <w:pPr>
         <w:rPr>
           <w:rFonts w:ascii="Times New Roman" w:eastAsiaTheme="majorEastAsia" w:hAnsi="Times New Roman" w:cs="Times New Roman"/>
+          <w:b/>
+          <w:bCs/>
           <w:kern w:val="2"/>
           <w:sz w:val="28"/>
           <w:szCs w:val="28"/>
@@ -10544,6 +10635,8 @@
       <w:r>
         <w:rPr>
           <w:rFonts w:ascii="Times New Roman" w:eastAsiaTheme="majorEastAsia" w:hAnsi="Times New Roman" w:cs="Times New Roman"/>
+          <w:b/>
+          <w:bCs/>
           <w:kern w:val="2"/>
           <w:sz w:val="28"/>
           <w:szCs w:val="28"/>
@@ -10605,6 +10698,8 @@
       <w:pPr>
         <w:rPr>
           <w:rFonts w:ascii="Times New Roman" w:eastAsiaTheme="majorEastAsia" w:hAnsi="Times New Roman" w:cs="Times New Roman"/>
+          <w:b/>
+          <w:bCs/>
           <w:kern w:val="2"/>
           <w:sz w:val="28"/>
           <w:szCs w:val="28"/>
@@ -10615,6 +10710,8 @@
       <w:r>
         <w:rPr>
           <w:rFonts w:ascii="Times New Roman" w:eastAsiaTheme="majorEastAsia" w:hAnsi="Times New Roman" w:cs="Times New Roman"/>
+          <w:b/>
+          <w:bCs/>
           <w:kern w:val="2"/>
           <w:sz w:val="28"/>
           <w:szCs w:val="28"/>
@@ -10627,6 +10724,8 @@
       <w:r>
         <w:rPr>
           <w:rFonts w:ascii="Times New Roman" w:eastAsiaTheme="majorEastAsia" w:hAnsi="Times New Roman" w:cs="Times New Roman"/>
+          <w:b/>
+          <w:bCs/>
           <w:kern w:val="2"/>
           <w:sz w:val="28"/>
           <w:szCs w:val="28"/>
@@ -10639,6 +10738,8 @@
       <w:r>
         <w:rPr>
           <w:rFonts w:ascii="Times New Roman" w:eastAsiaTheme="majorEastAsia" w:hAnsi="Times New Roman" w:cs="Times New Roman"/>
+          <w:b/>
+          <w:bCs/>
           <w:kern w:val="2"/>
           <w:sz w:val="28"/>
           <w:szCs w:val="28"/>
@@ -10675,6 +10776,8 @@
       <w:pPr>
         <w:rPr>
           <w:rFonts w:ascii="Times New Roman" w:eastAsiaTheme="majorEastAsia" w:hAnsi="Times New Roman" w:cs="Times New Roman"/>
+          <w:b/>
+          <w:bCs/>
           <w:kern w:val="2"/>
           <w:sz w:val="28"/>
           <w:szCs w:val="28"/>
@@ -10685,6 +10788,8 @@
       <w:r>
         <w:rPr>
           <w:rFonts w:ascii="Times New Roman" w:eastAsiaTheme="majorEastAsia" w:hAnsi="Times New Roman" w:cs="Times New Roman"/>
+          <w:b/>
+          <w:bCs/>
           <w:kern w:val="2"/>
           <w:sz w:val="28"/>
           <w:szCs w:val="28"/>
@@ -10697,6 +10802,8 @@
       <w:r>
         <w:rPr>
           <w:rFonts w:ascii="Times New Roman" w:eastAsiaTheme="majorEastAsia" w:hAnsi="Times New Roman" w:cs="Times New Roman"/>
+          <w:b/>
+          <w:bCs/>
           <w:kern w:val="2"/>
           <w:sz w:val="28"/>
           <w:szCs w:val="28"/>
@@ -10709,6 +10816,8 @@
       <w:r>
         <w:rPr>
           <w:rFonts w:ascii="Times New Roman" w:eastAsiaTheme="majorEastAsia" w:hAnsi="Times New Roman" w:cs="Times New Roman"/>
+          <w:b/>
+          <w:bCs/>
           <w:kern w:val="2"/>
           <w:sz w:val="28"/>
           <w:szCs w:val="28"/>
@@ -12466,6 +12575,7 @@
   <w:style w:type="character" w:default="1" w:styleId="DefaultParagraphFont">
     <w:name w:val="Default Paragraph Font"/>
     <w:uiPriority w:val="1"/>
+    <w:semiHidden/>
     <w:unhideWhenUsed/>
   </w:style>
   <w:style w:type="table" w:default="1" w:styleId="TableNormal">

</xml_diff>